<commit_message>
added learning objectives to existing docs, added repo lesson
</commit_message>
<xml_diff>
--- a/Beginner/InstallingGit.docx
+++ b/Beginner/InstallingGit.docx
@@ -10,6 +10,93 @@
         <w:t>Installing Git on Windows, MacOS, and Linux</w:t>
       </w:r>
     </w:p>
+    <w:p>
+      <w:pPr>
+        <w:pStyle w:val="Heading2"/>
+      </w:pPr>
+      <w:r>
+        <w:t>Learning Objectives:</w:t>
+      </w:r>
+    </w:p>
+    <w:p>
+      <w:r>
+        <w:t xml:space="preserve">At the completion of this </w:t>
+      </w:r>
+      <w:r>
+        <w:t>tutorial</w:t>
+      </w:r>
+      <w:r>
+        <w:t>, learners will be able to:</w:t>
+      </w:r>
+    </w:p>
+    <w:p>
+      <w:pPr>
+        <w:pStyle w:val="ListParagraph"/>
+        <w:numPr>
+          <w:ilvl w:val="0"/>
+          <w:numId w:val="2"/>
+        </w:numPr>
+      </w:pPr>
+      <w:r>
+        <w:t>Differentiate between Git and GitHub.</w:t>
+      </w:r>
+    </w:p>
+    <w:p>
+      <w:pPr>
+        <w:pStyle w:val="ListParagraph"/>
+        <w:numPr>
+          <w:ilvl w:val="0"/>
+          <w:numId w:val="2"/>
+        </w:numPr>
+      </w:pPr>
+      <w:r>
+        <w:t>Identify the two ways of interacting with Git that we have installed.</w:t>
+      </w:r>
+    </w:p>
+    <w:p>
+      <w:pPr>
+        <w:pStyle w:val="ListParagraph"/>
+        <w:numPr>
+          <w:ilvl w:val="0"/>
+          <w:numId w:val="2"/>
+        </w:numPr>
+      </w:pPr>
+      <w:r>
+        <w:t>Download and install Git on the operating system of choice.</w:t>
+      </w:r>
+    </w:p>
+    <w:p>
+      <w:pPr>
+        <w:pStyle w:val="ListParagraph"/>
+        <w:numPr>
+          <w:ilvl w:val="0"/>
+          <w:numId w:val="2"/>
+        </w:numPr>
+      </w:pPr>
+      <w:r>
+        <w:t>Verify that Git has been installed successfully.</w:t>
+      </w:r>
+    </w:p>
+    <w:p>
+      <w:pPr>
+        <w:pStyle w:val="ListParagraph"/>
+        <w:numPr>
+          <w:ilvl w:val="0"/>
+          <w:numId w:val="2"/>
+        </w:numPr>
+      </w:pPr>
+      <w:r>
+        <w:t>Explain the purpose of changing configuration options for username and email.</w:t>
+      </w:r>
+    </w:p>
+    <w:p>
+      <w:pPr>
+        <w:pBdr>
+          <w:bottom w:val="single" w:sz="12" w:space="1" w:color="auto"/>
+        </w:pBdr>
+      </w:pPr>
+    </w:p>
+    <w:p/>
     <w:p>
       <w:r>
         <w:t xml:space="preserve">In </w:t>
@@ -40,15 +127,7 @@
         </w:numPr>
       </w:pPr>
       <w:r>
-        <w:t xml:space="preserve">Git Bash- This is a command line interface (CLI) that allows you to interact with Git using the command line. Bash is </w:t>
-      </w:r>
-      <w:proofErr w:type="gramStart"/>
-      <w:r>
-        <w:t>actually an</w:t>
-      </w:r>
-      <w:proofErr w:type="gramEnd"/>
-      <w:r>
-        <w:t xml:space="preserve"> acronym that stands for Bourne Again Shell, which is the successor of the original Unix command line shell</w:t>
+        <w:t>Git Bash- This is a command line interface (CLI) that allows you to interact with Git using the command line. Bash is actually an acronym that stands for Bourne Again Shell, which is the successor of the original Unix command line shell</w:t>
       </w:r>
       <w:r>
         <w:t xml:space="preserve"> created by Stephen Bourne</w:t>
@@ -74,15 +153,7 @@
     </w:p>
     <w:p>
       <w:r>
-        <w:t xml:space="preserve">By the end of this guide, you will have Git </w:t>
-      </w:r>
-      <w:proofErr w:type="gramStart"/>
-      <w:r>
-        <w:t>installed,</w:t>
-      </w:r>
-      <w:proofErr w:type="gramEnd"/>
-      <w:r>
-        <w:t xml:space="preserve"> a way or ways to interact with it, and be ready to create and manage repositories at the local level.</w:t>
+        <w:t>By the end of this guide, you will have Git installed, a way or ways to interact with it, and be ready to create and manage repositories at the local level.</w:t>
       </w:r>
     </w:p>
     <w:p/>
@@ -91,6 +162,7 @@
         <w:pStyle w:val="Heading2"/>
       </w:pPr>
       <w:r>
+        <w:lastRenderedPageBreak/>
         <w:t>Windows Installation</w:t>
       </w:r>
     </w:p>
@@ -133,40 +205,20 @@
         <w:rPr>
           <w:color w:val="196B24" w:themeColor="accent3"/>
         </w:rPr>
-        <w:t>Get-</w:t>
-      </w:r>
-      <w:proofErr w:type="spellStart"/>
+        <w:t>Get-CimInstance Win32_OperatingSystem | Select-Object OSArchitecture</w:t>
+      </w:r>
       <w:r>
         <w:rPr>
           <w:color w:val="196B24" w:themeColor="accent3"/>
         </w:rPr>
-        <w:t>CimInstance</w:t>
-      </w:r>
-      <w:proofErr w:type="spellEnd"/>
-      <w:r>
-        <w:rPr>
-          <w:color w:val="196B24" w:themeColor="accent3"/>
-        </w:rPr>
-        <w:t xml:space="preserve"> Win32_OperatingSystem | Select-Object </w:t>
-      </w:r>
-      <w:proofErr w:type="spellStart"/>
-      <w:r>
-        <w:rPr>
-          <w:color w:val="196B24" w:themeColor="accent3"/>
-        </w:rPr>
-        <w:t>OSArchitecture</w:t>
-      </w:r>
-      <w:proofErr w:type="spellEnd"/>
-      <w:r>
-        <w:rPr>
-          <w:color w:val="196B24" w:themeColor="accent3"/>
-        </w:rPr>
         <w:t xml:space="preserve">  </w:t>
       </w:r>
     </w:p>
     <w:p>
       <w:r>
-        <w:lastRenderedPageBreak/>
+        <w:rPr>
+          <w:noProof/>
+        </w:rPr>
         <w:drawing>
           <wp:inline distT="0" distB="0" distL="0" distR="0" wp14:anchorId="5B912C4F" wp14:editId="625B96A0">
             <wp:extent cx="5943600" cy="758190"/>
@@ -211,6 +263,9 @@
     </w:p>
     <w:p>
       <w:r>
+        <w:rPr>
+          <w:noProof/>
+        </w:rPr>
         <w:drawing>
           <wp:inline distT="0" distB="0" distL="0" distR="0" wp14:anchorId="259AB1A7" wp14:editId="4712DAEE">
             <wp:extent cx="5943600" cy="2697480"/>
@@ -266,6 +321,7 @@
         <w:pStyle w:val="Heading3"/>
       </w:pPr>
       <w:r>
+        <w:lastRenderedPageBreak/>
         <w:t>Step 3: Configuring the Installation Options</w:t>
       </w:r>
     </w:p>
@@ -276,7 +332,9 @@
     </w:p>
     <w:p>
       <w:r>
-        <w:lastRenderedPageBreak/>
+        <w:rPr>
+          <w:noProof/>
+        </w:rPr>
         <w:drawing>
           <wp:inline distT="0" distB="0" distL="0" distR="0" wp14:anchorId="2B730C09" wp14:editId="73F298EA">
             <wp:extent cx="3619500" cy="2816519"/>
@@ -316,6 +374,9 @@
     </w:p>
     <w:p>
       <w:r>
+        <w:rPr>
+          <w:noProof/>
+        </w:rPr>
         <w:drawing>
           <wp:inline distT="0" distB="0" distL="0" distR="0" wp14:anchorId="20110371" wp14:editId="2BDA091C">
             <wp:extent cx="3638550" cy="2834756"/>
@@ -358,6 +419,9 @@
         <w:jc w:val="center"/>
       </w:pPr>
       <w:r>
+        <w:rPr>
+          <w:noProof/>
+        </w:rPr>
         <w:lastRenderedPageBreak/>
         <w:drawing>
           <wp:inline distT="0" distB="0" distL="0" distR="0" wp14:anchorId="5A2A0685" wp14:editId="10F47BE1">
@@ -401,6 +465,9 @@
         <w:jc w:val="center"/>
       </w:pPr>
       <w:r>
+        <w:rPr>
+          <w:noProof/>
+        </w:rPr>
         <w:drawing>
           <wp:inline distT="0" distB="0" distL="0" distR="0" wp14:anchorId="370EEFEA" wp14:editId="312D0E36">
             <wp:extent cx="3657600" cy="2827726"/>
@@ -440,15 +507,7 @@
     </w:p>
     <w:p>
       <w:r>
-        <w:t xml:space="preserve">We are going to make a change on this page by selecting </w:t>
-      </w:r>
-      <w:proofErr w:type="gramStart"/>
-      <w:r>
-        <w:t>the override the</w:t>
-      </w:r>
-      <w:proofErr w:type="gramEnd"/>
-      <w:r>
-        <w:t xml:space="preserve"> default branch name for new repositories. The default is to let Git decide, but we want to make this change for simplicity’s sake. If you let Git decide, when creating repositories your default branch would be “master” instead of “main”, but when creating repositories from Git Hub like we will be later, the default branch will be “main” by default. By making this change, we can ensure that our default branch is “main” regardless of how we create our repository.</w:t>
+        <w:t>We are going to make a change on this page by selecting the override the default branch name for new repositories. The default is to let Git decide, but we want to make this change for simplicity’s sake. If you let Git decide, when creating repositories your default branch would be “master” instead of “main”, but when creating repositories from Git Hub like we will be later, the default branch will be “main” by default. By making this change, we can ensure that our default branch is “main” regardless of how we create our repository.</w:t>
       </w:r>
     </w:p>
     <w:p>
@@ -456,6 +515,9 @@
         <w:jc w:val="center"/>
       </w:pPr>
       <w:r>
+        <w:rPr>
+          <w:noProof/>
+        </w:rPr>
         <w:lastRenderedPageBreak/>
         <w:drawing>
           <wp:inline distT="0" distB="0" distL="0" distR="0" wp14:anchorId="5BF18461" wp14:editId="269A38E4">
@@ -499,6 +561,9 @@
         <w:jc w:val="center"/>
       </w:pPr>
       <w:r>
+        <w:rPr>
+          <w:noProof/>
+        </w:rPr>
         <w:drawing>
           <wp:inline distT="0" distB="0" distL="0" distR="0" wp14:anchorId="183E01C6" wp14:editId="223F4835">
             <wp:extent cx="2972730" cy="2295525"/>
@@ -541,6 +606,9 @@
         <w:jc w:val="center"/>
       </w:pPr>
       <w:r>
+        <w:rPr>
+          <w:noProof/>
+        </w:rPr>
         <w:drawing>
           <wp:inline distT="0" distB="0" distL="0" distR="0" wp14:anchorId="62DEE5CA" wp14:editId="728D7EB5">
             <wp:extent cx="2933246" cy="2276475"/>
@@ -584,6 +652,9 @@
         <w:jc w:val="center"/>
       </w:pPr>
       <w:r>
+        <w:rPr>
+          <w:noProof/>
+        </w:rPr>
         <w:lastRenderedPageBreak/>
         <w:drawing>
           <wp:inline distT="0" distB="0" distL="0" distR="0" wp14:anchorId="3087A45E" wp14:editId="06419916">
@@ -622,6 +693,9 @@
         </w:drawing>
       </w:r>
       <w:r>
+        <w:rPr>
+          <w:noProof/>
+        </w:rPr>
         <w:drawing>
           <wp:inline distT="0" distB="0" distL="0" distR="0" wp14:anchorId="10AB3D04" wp14:editId="7A405DCC">
             <wp:extent cx="2985065" cy="2305050"/>
@@ -664,6 +738,9 @@
         <w:jc w:val="center"/>
       </w:pPr>
       <w:r>
+        <w:rPr>
+          <w:noProof/>
+        </w:rPr>
         <w:drawing>
           <wp:inline distT="0" distB="0" distL="0" distR="0" wp14:anchorId="650155B5" wp14:editId="00994A33">
             <wp:extent cx="2984500" cy="2316253"/>
@@ -706,6 +783,9 @@
         <w:jc w:val="center"/>
       </w:pPr>
       <w:r>
+        <w:rPr>
+          <w:noProof/>
+        </w:rPr>
         <w:lastRenderedPageBreak/>
         <w:drawing>
           <wp:inline distT="0" distB="0" distL="0" distR="0" wp14:anchorId="72750810" wp14:editId="2D513034">
@@ -749,6 +829,9 @@
         <w:jc w:val="center"/>
       </w:pPr>
       <w:r>
+        <w:rPr>
+          <w:noProof/>
+        </w:rPr>
         <w:drawing>
           <wp:inline distT="0" distB="0" distL="0" distR="0" wp14:anchorId="00BC8333" wp14:editId="47B3A4F8">
             <wp:extent cx="2904150" cy="2247900"/>
@@ -796,6 +879,9 @@
         <w:jc w:val="center"/>
       </w:pPr>
       <w:r>
+        <w:rPr>
+          <w:noProof/>
+        </w:rPr>
         <w:drawing>
           <wp:inline distT="0" distB="0" distL="0" distR="0" wp14:anchorId="179B7DC3" wp14:editId="5DD230D8">
             <wp:extent cx="3476625" cy="2693654"/>
@@ -880,44 +966,23 @@
           <w:color w:val="196B24" w:themeColor="accent3"/>
         </w:rPr>
       </w:pPr>
-      <w:proofErr w:type="spellStart"/>
       <w:r>
         <w:rPr>
           <w:color w:val="196B24" w:themeColor="accent3"/>
         </w:rPr>
-        <w:t>sudo</w:t>
-      </w:r>
-      <w:proofErr w:type="spellEnd"/>
-      <w:r>
+        <w:t xml:space="preserve">sudo apt update &amp;&amp; sudo apt install git </w:t>
+      </w:r>
+    </w:p>
+    <w:p>
+      <w:pPr>
+        <w:jc w:val="center"/>
         <w:rPr>
           <w:color w:val="196B24" w:themeColor="accent3"/>
         </w:rPr>
-        <w:t xml:space="preserve"> apt update &amp;&amp; </w:t>
-      </w:r>
-      <w:proofErr w:type="spellStart"/>
-      <w:r>
-        <w:rPr>
-          <w:color w:val="196B24" w:themeColor="accent3"/>
-        </w:rPr>
-        <w:t>sudo</w:t>
-      </w:r>
-      <w:proofErr w:type="spellEnd"/>
-      <w:r>
-        <w:rPr>
-          <w:color w:val="196B24" w:themeColor="accent3"/>
-        </w:rPr>
-        <w:t xml:space="preserve"> apt install git </w:t>
-      </w:r>
-    </w:p>
-    <w:p>
-      <w:pPr>
-        <w:jc w:val="center"/>
-        <w:rPr>
-          <w:color w:val="196B24" w:themeColor="accent3"/>
-        </w:rPr>
-      </w:pPr>
-      <w:r>
-        <w:rPr>
+      </w:pPr>
+      <w:r>
+        <w:rPr>
+          <w:noProof/>
           <w:color w:val="196B24" w:themeColor="accent3"/>
         </w:rPr>
         <w:drawing>
@@ -966,21 +1031,8 @@
       </w:r>
     </w:p>
     <w:p>
-      <w:proofErr w:type="gramStart"/>
-      <w:r>
-        <w:t>As long as</w:t>
-      </w:r>
-      <w:proofErr w:type="gramEnd"/>
-      <w:r>
-        <w:t xml:space="preserve"> there are no errors in the installation, this is the only step we need to </w:t>
-      </w:r>
-      <w:proofErr w:type="gramStart"/>
-      <w:r>
-        <w:t>do</w:t>
-      </w:r>
-      <w:proofErr w:type="gramEnd"/>
-      <w:r>
-        <w:t xml:space="preserve"> for the Linux version.</w:t>
+      <w:r>
+        <w:t>As long as there are no errors in the installation, this is the only step we need to do for the Linux version.</w:t>
       </w:r>
     </w:p>
     <w:p>
@@ -1022,15 +1074,7 @@
     </w:p>
     <w:p>
       <w:r>
-        <w:t xml:space="preserve">On newer versions of MacOS, Git is </w:t>
-      </w:r>
-      <w:proofErr w:type="gramStart"/>
-      <w:r>
-        <w:t>actually installed</w:t>
-      </w:r>
-      <w:proofErr w:type="gramEnd"/>
-      <w:r>
-        <w:t xml:space="preserve"> by default. You can check this by running the command</w:t>
+        <w:t>On newer versions of MacOS, Git is actually installed by default. You can check this by running the command</w:t>
       </w:r>
       <w:r>
         <w:t xml:space="preserve"> within the Mac terminal</w:t>
@@ -1129,6 +1173,9 @@
         <w:jc w:val="center"/>
       </w:pPr>
       <w:r>
+        <w:rPr>
+          <w:noProof/>
+        </w:rPr>
         <w:drawing>
           <wp:inline distT="0" distB="0" distL="0" distR="0" wp14:anchorId="76F32BB9" wp14:editId="69E146F3">
             <wp:extent cx="3181794" cy="562053"/>
@@ -1177,15 +1224,7 @@
     </w:p>
     <w:p>
       <w:r>
-        <w:t xml:space="preserve">Before we do anything with Git, we need to make sure that Git knows who we are! Why does this matter? Well, we know that Git </w:t>
-      </w:r>
-      <w:proofErr w:type="gramStart"/>
-      <w:r>
-        <w:t>has the ability to</w:t>
-      </w:r>
-      <w:proofErr w:type="gramEnd"/>
-      <w:r>
-        <w:t xml:space="preserve"> see the commit history of a repository by showing who has changed what and when. To make this possible, we need to tell Git who we are, so it knows who to attribute changes to.</w:t>
+        <w:t>Before we do anything with Git, we need to make sure that Git knows who we are! Why does this matter? Well, we know that Git has the ability to see the commit history of a repository by showing who has changed what and when. To make this possible, we need to tell Git who we are, so it knows who to attribute changes to.</w:t>
       </w:r>
       <w:r>
         <w:t xml:space="preserve"> This becomes much more important when we start working with remote repositories in later sections; so just ensure it is an email account that you can access!</w:t>
@@ -1194,15 +1233,7 @@
     <w:p>
       <w:r>
         <w:lastRenderedPageBreak/>
-        <w:t xml:space="preserve">Think of this information as being your digital signature attached to every commit you make, giving you the credit for the work that you have completed. This further allows team members if you are on a team </w:t>
-      </w:r>
-      <w:proofErr w:type="gramStart"/>
-      <w:r>
-        <w:t>project</w:t>
-      </w:r>
-      <w:proofErr w:type="gramEnd"/>
-      <w:r>
-        <w:t xml:space="preserve"> be able to reach out to the author of some work found in the team project!</w:t>
+        <w:t>Think of this information as being your digital signature attached to every commit you make, giving you the credit for the work that you have completed. This further allows team members if you are on a team project be able to reach out to the author of some work found in the team project!</w:t>
       </w:r>
     </w:p>
     <w:p>
@@ -1212,15 +1243,7 @@
     </w:p>
     <w:p>
       <w:r>
-        <w:t xml:space="preserve">For the remainder of the guide, we will mostly be working with Git on Windows as that is my operating system of choice. However, the commands are the same regardless of operating system and anything that does not work the same way as it does in Windows, a quick ChatGPT inquiry will </w:t>
-      </w:r>
-      <w:proofErr w:type="gramStart"/>
-      <w:r>
-        <w:t>fix</w:t>
-      </w:r>
-      <w:proofErr w:type="gramEnd"/>
-      <w:r>
-        <w:t>! This is done to alleviate the amount of redundant content and streamline learning, not operating system bias.</w:t>
+        <w:t>For the remainder of the guide, we will mostly be working with Git on Windows as that is my operating system of choice. However, the commands are the same regardless of operating system and anything that does not work the same way as it does in Windows, a quick ChatGPT inquiry will fix! This is done to alleviate the amount of redundant content and streamline learning, not operating system bias.</w:t>
       </w:r>
     </w:p>
     <w:p/>
@@ -1258,46 +1281,24 @@
         <w:rPr>
           <w:color w:val="196B24" w:themeColor="accent3"/>
         </w:rPr>
-        <w:t>git config --</w:t>
-      </w:r>
-      <w:proofErr w:type="gramStart"/>
-      <w:r>
+        <w:t>git config --global  user.name “John Doe”</w:t>
+      </w:r>
+    </w:p>
+    <w:p>
+      <w:r>
+        <w:t>All you need to do now is change the John Doe to your actual name, and you want to make sure to include the quotes. To check to see if your name was configured correctly, use the same command but leave out the name and quotes like this:</w:t>
+      </w:r>
+    </w:p>
+    <w:p>
+      <w:pPr>
         <w:rPr>
           <w:color w:val="196B24" w:themeColor="accent3"/>
         </w:rPr>
-        <w:t>global  user.name</w:t>
-      </w:r>
-      <w:proofErr w:type="gramEnd"/>
+      </w:pPr>
       <w:r>
         <w:rPr>
           <w:color w:val="196B24" w:themeColor="accent3"/>
         </w:rPr>
-        <w:t xml:space="preserve"> “John Doe”</w:t>
-      </w:r>
-    </w:p>
-    <w:p>
-      <w:r>
-        <w:t xml:space="preserve">All you need to do now is change </w:t>
-      </w:r>
-      <w:proofErr w:type="gramStart"/>
-      <w:r>
-        <w:t>the John</w:t>
-      </w:r>
-      <w:proofErr w:type="gramEnd"/>
-      <w:r>
-        <w:t xml:space="preserve"> Doe to your actual name, and you want to make sure to include the quotes. To check to see if your name was configured correctly, use the same command but leave out the name and quotes like this:</w:t>
-      </w:r>
-    </w:p>
-    <w:p>
-      <w:pPr>
-        <w:rPr>
-          <w:color w:val="196B24" w:themeColor="accent3"/>
-        </w:rPr>
-      </w:pPr>
-      <w:r>
-        <w:rPr>
-          <w:color w:val="196B24" w:themeColor="accent3"/>
-        </w:rPr>
         <w:t>git config --global user.name</w:t>
       </w:r>
     </w:p>
@@ -1311,6 +1312,9 @@
         <w:jc w:val="center"/>
       </w:pPr>
       <w:r>
+        <w:rPr>
+          <w:noProof/>
+        </w:rPr>
         <w:drawing>
           <wp:inline distT="0" distB="0" distL="0" distR="0" wp14:anchorId="5A21577F" wp14:editId="4C268E5C">
             <wp:extent cx="3629532" cy="943107"/>
@@ -1355,25 +1359,12 @@
       </w:pPr>
       <w:r>
         <w:lastRenderedPageBreak/>
-        <w:t xml:space="preserve">Setting Your </w:t>
-      </w:r>
-      <w:r>
-        <w:t>Email</w:t>
-      </w:r>
-    </w:p>
-    <w:p>
-      <w:r>
-        <w:t xml:space="preserve">Next, configuring your email address is just as straightforward as the username step. This time we will replace the user.name to </w:t>
-      </w:r>
-      <w:proofErr w:type="spellStart"/>
-      <w:proofErr w:type="gramStart"/>
-      <w:r>
-        <w:t>user.email</w:t>
-      </w:r>
-      <w:proofErr w:type="spellEnd"/>
-      <w:proofErr w:type="gramEnd"/>
-      <w:r>
-        <w:t xml:space="preserve"> as such:</w:t>
+        <w:t>Setting Your Email</w:t>
+      </w:r>
+    </w:p>
+    <w:p>
+      <w:r>
+        <w:t>Next, configuring your email address is just as straightforward as the username step. This time we will replace the user.name to user.email as such:</w:t>
       </w:r>
     </w:p>
     <w:p>
@@ -1386,34 +1377,18 @@
         <w:rPr>
           <w:color w:val="196B24" w:themeColor="accent3"/>
         </w:rPr>
-        <w:t xml:space="preserve">git config --global </w:t>
-      </w:r>
-      <w:proofErr w:type="spellStart"/>
-      <w:proofErr w:type="gramStart"/>
+        <w:t>git config --global user.</w:t>
+      </w:r>
       <w:r>
         <w:rPr>
           <w:color w:val="196B24" w:themeColor="accent3"/>
         </w:rPr>
-        <w:t>user.</w:t>
+        <w:t xml:space="preserve">email </w:t>
       </w:r>
       <w:r>
         <w:rPr>
           <w:color w:val="196B24" w:themeColor="accent3"/>
         </w:rPr>
-        <w:t>email</w:t>
-      </w:r>
-      <w:proofErr w:type="spellEnd"/>
-      <w:proofErr w:type="gramEnd"/>
-      <w:r>
-        <w:rPr>
-          <w:color w:val="196B24" w:themeColor="accent3"/>
-        </w:rPr>
-        <w:t xml:space="preserve"> </w:t>
-      </w:r>
-      <w:r>
-        <w:rPr>
-          <w:color w:val="196B24" w:themeColor="accent3"/>
-        </w:rPr>
         <w:t>john.doe@example.com</w:t>
       </w:r>
     </w:p>
@@ -1433,15 +1408,7 @@
     </w:p>
     <w:p>
       <w:r>
-        <w:t xml:space="preserve">Now that we know what Git is, a basic understanding of how </w:t>
-      </w:r>
-      <w:proofErr w:type="spellStart"/>
-      <w:r>
-        <w:t>Git</w:t>
-      </w:r>
-      <w:proofErr w:type="spellEnd"/>
-      <w:r>
-        <w:t xml:space="preserve"> works, and Git knows who we are; we are finally ready to make our first repository and start tracking changes to our files!</w:t>
+        <w:t>Now that we know what Git is, a basic understanding of how Git works, and Git knows who we are; we are finally ready to make our first repository and start tracking changes to our files!</w:t>
       </w:r>
     </w:p>
     <w:p>
@@ -1466,6 +1433,95 @@
 <file path=word/numbering.xml><?xml version="1.0" encoding="utf-8"?>
 <w:numbering xmlns:wpc="http://schemas.microsoft.com/office/word/2010/wordprocessingCanvas" xmlns:cx="http://schemas.microsoft.com/office/drawing/2014/chartex" xmlns:cx1="http://schemas.microsoft.com/office/drawing/2015/9/8/chartex" xmlns:cx2="http://schemas.microsoft.com/office/drawing/2015/10/21/chartex" xmlns:cx3="http://schemas.microsoft.com/office/drawing/2016/5/9/chartex" xmlns:cx4="http://schemas.microsoft.com/office/drawing/2016/5/10/chartex" xmlns:cx5="http://schemas.microsoft.com/office/drawing/2016/5/11/chartex" xmlns:cx6="http://schemas.microsoft.com/office/drawing/2016/5/12/chartex" xmlns:cx7="http://schemas.microsoft.com/office/drawing/2016/5/13/chartex" xmlns:cx8="http://schemas.microsoft.com/office/drawing/2016/5/14/chartex" xmlns:mc="http://schemas.openxmlformats.org/markup-compatibility/2006" xmlns:aink="http://schemas.microsoft.com/office/drawing/2016/ink" xmlns:am3d="http://schemas.microsoft.com/office/drawing/2017/model3d" xmlns:o="urn:schemas-microsoft-com:office:office" xmlns:oel="http://schemas.microsoft.com/office/2019/extlst" xmlns:r="http://schemas.openxmlformats.org/officeDocument/2006/relationships" xmlns:m="http://schemas.openxmlformats.org/officeDocument/2006/math" xmlns:v="urn:schemas-microsoft-com:vml" xmlns:wp14="http://schemas.microsoft.com/office/word/2010/wordprocessingDrawing" xmlns:wp="http://schemas.openxmlformats.org/drawingml/2006/wordprocessingDrawing" xmlns:w10="urn:schemas-microsoft-com:office:word" xmlns:w="http://schemas.openxmlformats.org/wordprocessingml/2006/main" xmlns:w14="http://schemas.microsoft.com/office/word/2010/wordml" xmlns:w15="http://schemas.microsoft.com/office/word/2012/wordml" xmlns:w16cex="http://schemas.microsoft.com/office/word/2018/wordml/cex" xmlns:w16cid="http://schemas.microsoft.com/office/word/2016/wordml/cid" xmlns:w16="http://schemas.microsoft.com/office/word/2018/wordml" xmlns:w16du="http://schemas.microsoft.com/office/word/2023/wordml/word16du" xmlns:w16sdtdh="http://schemas.microsoft.com/office/word/2020/wordml/sdtdatahash" xmlns:w16sdtfl="http://schemas.microsoft.com/office/word/2024/wordml/sdtformatlock" xmlns:w16se="http://schemas.microsoft.com/office/word/2015/wordml/symex" xmlns:wpg="http://schemas.microsoft.com/office/word/2010/wordprocessingGroup" xmlns:wpi="http://schemas.microsoft.com/office/word/2010/wordprocessingInk" xmlns:wne="http://schemas.microsoft.com/office/word/2006/wordml" xmlns:wps="http://schemas.microsoft.com/office/word/2010/wordprocessingShape" mc:Ignorable="w14 w15 w16se w16cid w16 w16cex w16sdtdh w16sdtfl w16du wp14">
   <w:abstractNum w:abstractNumId="0" w15:restartNumberingAfterBreak="0">
+    <w:nsid w:val="3379672C"/>
+    <w:multiLevelType w:val="hybridMultilevel"/>
+    <w:tmpl w:val="D0004432"/>
+    <w:lvl w:ilvl="0" w:tplc="0409000F">
+      <w:start w:val="1"/>
+      <w:numFmt w:val="decimal"/>
+      <w:lvlText w:val="%1."/>
+      <w:lvlJc w:val="left"/>
+      <w:pPr>
+        <w:ind w:left="720" w:hanging="360"/>
+      </w:pPr>
+      <w:rPr>
+        <w:rFonts w:hint="default"/>
+      </w:rPr>
+    </w:lvl>
+    <w:lvl w:ilvl="1" w:tplc="04090019" w:tentative="1">
+      <w:start w:val="1"/>
+      <w:numFmt w:val="lowerLetter"/>
+      <w:lvlText w:val="%2."/>
+      <w:lvlJc w:val="left"/>
+      <w:pPr>
+        <w:ind w:left="1440" w:hanging="360"/>
+      </w:pPr>
+    </w:lvl>
+    <w:lvl w:ilvl="2" w:tplc="0409001B" w:tentative="1">
+      <w:start w:val="1"/>
+      <w:numFmt w:val="lowerRoman"/>
+      <w:lvlText w:val="%3."/>
+      <w:lvlJc w:val="right"/>
+      <w:pPr>
+        <w:ind w:left="2160" w:hanging="180"/>
+      </w:pPr>
+    </w:lvl>
+    <w:lvl w:ilvl="3" w:tplc="0409000F" w:tentative="1">
+      <w:start w:val="1"/>
+      <w:numFmt w:val="decimal"/>
+      <w:lvlText w:val="%4."/>
+      <w:lvlJc w:val="left"/>
+      <w:pPr>
+        <w:ind w:left="2880" w:hanging="360"/>
+      </w:pPr>
+    </w:lvl>
+    <w:lvl w:ilvl="4" w:tplc="04090019" w:tentative="1">
+      <w:start w:val="1"/>
+      <w:numFmt w:val="lowerLetter"/>
+      <w:lvlText w:val="%5."/>
+      <w:lvlJc w:val="left"/>
+      <w:pPr>
+        <w:ind w:left="3600" w:hanging="360"/>
+      </w:pPr>
+    </w:lvl>
+    <w:lvl w:ilvl="5" w:tplc="0409001B" w:tentative="1">
+      <w:start w:val="1"/>
+      <w:numFmt w:val="lowerRoman"/>
+      <w:lvlText w:val="%6."/>
+      <w:lvlJc w:val="right"/>
+      <w:pPr>
+        <w:ind w:left="4320" w:hanging="180"/>
+      </w:pPr>
+    </w:lvl>
+    <w:lvl w:ilvl="6" w:tplc="0409000F" w:tentative="1">
+      <w:start w:val="1"/>
+      <w:numFmt w:val="decimal"/>
+      <w:lvlText w:val="%7."/>
+      <w:lvlJc w:val="left"/>
+      <w:pPr>
+        <w:ind w:left="5040" w:hanging="360"/>
+      </w:pPr>
+    </w:lvl>
+    <w:lvl w:ilvl="7" w:tplc="04090019" w:tentative="1">
+      <w:start w:val="1"/>
+      <w:numFmt w:val="lowerLetter"/>
+      <w:lvlText w:val="%8."/>
+      <w:lvlJc w:val="left"/>
+      <w:pPr>
+        <w:ind w:left="5760" w:hanging="360"/>
+      </w:pPr>
+    </w:lvl>
+    <w:lvl w:ilvl="8" w:tplc="0409001B" w:tentative="1">
+      <w:start w:val="1"/>
+      <w:numFmt w:val="lowerRoman"/>
+      <w:lvlText w:val="%9."/>
+      <w:lvlJc w:val="right"/>
+      <w:pPr>
+        <w:ind w:left="6480" w:hanging="180"/>
+      </w:pPr>
+    </w:lvl>
+  </w:abstractNum>
+  <w:abstractNum w:abstractNumId="1" w15:restartNumberingAfterBreak="0">
     <w:nsid w:val="4CA46684"/>
     <w:multiLevelType w:val="hybridMultilevel"/>
     <w:tmpl w:val="6330C448"/>
@@ -1579,6 +1635,9 @@
     </w:lvl>
   </w:abstractNum>
   <w:num w:numId="1" w16cid:durableId="589655372">
+    <w:abstractNumId w:val="1"/>
+  </w:num>
+  <w:num w:numId="2" w16cid:durableId="1946576728">
     <w:abstractNumId w:val="0"/>
   </w:num>
 </w:numbering>
@@ -2185,6 +2244,7 @@
   <w:style w:type="character" w:default="1" w:styleId="DefaultParagraphFont">
     <w:name w:val="Default Paragraph Font"/>
     <w:uiPriority w:val="1"/>
+    <w:semiHidden/>
     <w:unhideWhenUsed/>
   </w:style>
   <w:style w:type="table" w:default="1" w:styleId="TableNormal">

</xml_diff>